<commit_message>
report: final audit PASS - SOURCE-AUDIT.md + 3 softens
Report-auditor gate complete: 0 untraceable claims across all tags,
~115 numbers re-derived exactly (engine, XBRL, arithmetic). Softens:
pension deficit->liability (surplus asset exclusion made explicit),
sbc base 1.74->~1.7% (XBRL gives 1.71%), options-market lead re-tagged
as our Interpretation. Coverage flags C1-C5 recorded for the P1
statement-coverage audit (headline: $71.0B remaining performance
obligation unused/unmentioned).

Co-Authored-By: Claude Fable 5 <noreply@anthropic.com>
</commit_message>
<xml_diff>
--- a/analysis/IBM/report/IBM-valuation-2026-07.docx
+++ b/analysis/IBM/report/IBM-valuation-2026-07.docx
@@ -1606,7 +1606,7 @@
         <w:ind w:firstLine="360"/>
       </w:pPr>
       <w:r>
-        <w:t>Equity value per share = (PV of FCFF + PV of TV − net debt $54.0B) / 948.7M diluted shares. Both figures carry over from the v3 stock-vs-flow bridge (README v3): net debt = total debt $61.3B + after-tax pension deficit $7.1B − cash and marketable securities $14.4B, with operating leases and financing receivables deliberately excluded because their flows already live in the margin; shares are held flat because stock-based compensation (SBC) is charged as a cash cost — growing the count too would double-charg</w:t>
+        <w:t xml:space="preserve">Equity value per share = (PV of FCFF + PV of TV − net debt $54.0B) / 948.7M diluted shares. Both figures carry over from the v3 stock-vs-flow bridge (README v3): net debt = total debt $61.3B + after-tax pension liability $7.1B (liability-only; the overfunded-plan surplus asset is deliberately excluded) − cash and marketable securities $14.4B, with operating leases and financing receivables deliberately excluded because their flows already live in the margin; shares are held flat because stock-based compensation (SBC) is charged as a cash cost — growing the count too would double-charg</w:t>
       </w:r>
       <w:r>
         <w:t>e dilution [8].</w:t>
@@ -2481,7 +2481,7 @@
               <w:pStyle w:val="TableText"/>
             </w:pPr>
             <w:r>
-              <w:t>ratio rose 1.74% → 2.54% since 2021; constant embeds a trend break</w:t>
+              <w:t xml:space="preserve">ratio rose ~1.7% → 2.54% since 2021; constant embeds a trend break</w:t>
             </w:r>
           </w:p>
         </w:tc>
@@ -5375,7 +5375,7 @@
         <w:rPr>
           <w:b/>
         </w:rPr>
-        <w:t>The options market is pricing the event, not the verdict.</w:t>
+        <w:t xml:space="preserve">Our reading of the options market: it is pricing the event, not the verdict.</w:t>
       </w:r>
       <w:r>
         <w:t xml:space="preserve"> As of the 2026-07-16 snapshot (README v3): the Jul-24 expiry implies a </w:t>

</xml_diff>

<commit_message>
report: v4.1 - RPO consumed as watch-list item 4 and data note
Both files updated with ledger-precise RPO figures (105.1% coverage,
~67% within 2y, +12.7% YoY read net of HashiCorp consolidation),
FY2025 10-K added as source [10], TOC re-baked to 11 pages, issues 0.
Numbers and verdict unchanged (re-look rejected all parameter moves).
Token ledger: v4.1 exception run ~160k vs 2.6M frontier.

Co-Authored-By: Claude Fable 5 <noreply@anthropic.com>
</commit_message>
<xml_diff>
--- a/analysis/IBM/report/IBM-valuation-2026-07.docx
+++ b/analysis/IBM/report/IBM-valuation-2026-07.docx
@@ -804,7 +804,7 @@
           <w:rPr>
             <w:noProof/>
           </w:rPr>
-          <w:t>9</w:t>
+          <w:t>10</w:t>
         </w:r>
         <w:r>
           <w:rPr>
@@ -843,10 +843,7 @@
         <w:t>P10 $83.84 / P50 $151.84 / P90 $258.03</w:t>
       </w:r>
       <w:r>
-        <w:t xml:space="preserve">, conditional on the headline judgment that half of IBM’s recurring acquisition spend is a cost of staying in place (f = 0.50). Even the most generous published reading — f = 0, where all acquisition spend is treated as optional and only organic software growth is credited — puts the median at $197.79, still about 7% below the price. Reaching $212 inside this framework requires a discount rate below roughly 6.5% on any single published lever — holding every other judgment at base; stacked readings were not </w:t>
-      </w:r>
-      <w:r>
-        <w:t xml:space="preserve">run. At the trailing post-crash beta of 0.68 the bottom-up WACC falls to ≈6.5% and the median is still only $179.42. </w:t>
+        <w:t xml:space="preserve">, conditional on the headline judgment that half of IBM’s recurring acquisition spend is a cost of staying in place (f = 0.50). Even the most generous published reading — f = 0, where all acquisition spend is treated as optional and only organic software growth is credited — puts the median at $197.79, still about 7% below the price. Reaching $212 inside this framework requires a discount rate below roughly 6.5% on any single published lever — holding every other judgment at base; stacked readings were not run. At the trailing post-crash beta of 0.68 the bottom-up WACC falls to ≈6.5% and the median is still only $179.42. </w:t>
       </w:r>
       <w:r>
         <w:rPr>
@@ -863,6 +860,7 @@
         <w:ind w:firstLine="360"/>
       </w:pPr>
       <w:r>
+        <w:lastRenderedPageBreak/>
         <w:t>July 22, when IBM reports full Q2 results, adjudicates three falsifiable numbers: (a) whether the slipped large deals closed; (b) the FY2026 free-cash-flow guide against the ~$15.7B pre-warning bar; and (c) whether margins hold the FY2025 endpoint on which the model’s base is set. A fourth check is segment actuals against the model’s pinned year-1 growth (Software +5%, Consulting flat, Infrastructure at the warning-implied ~$14.6B).</w:t>
       </w:r>
     </w:p>
@@ -1156,10 +1154,7 @@
               <w:jc w:val="right"/>
             </w:pPr>
             <w:r>
-              <w:t>−</w:t>
-            </w:r>
-            <w:r>
-              <w:t>2%</w:t>
+              <w:t>−2%</w:t>
             </w:r>
           </w:p>
         </w:tc>
@@ -1296,7 +1291,11 @@
         <w:t>Interpretation.</w:t>
       </w:r>
       <w:r>
-        <w:t xml:space="preserve"> The consensus target requires stacking near-zero M&amp;A recurrence with a discount rate well below our bottom-up build — each defensible only if IBM’s M&amp;A is genuinely optional and its risk genuinely low.</w:t>
+        <w:t xml:space="preserve"> The consensus target requires stacking near-</w:t>
+      </w:r>
+      <w:r>
+        <w:lastRenderedPageBreak/>
+        <w:t>zero M&amp;A recurrence with a discount rate well below our bottom-up build — each defensible only if IBM’s M&amp;A is genuinely optional and its risk genuinely low.</w:t>
       </w:r>
     </w:p>
     <w:p>
@@ -1606,10 +1605,7 @@
         <w:ind w:firstLine="360"/>
       </w:pPr>
       <w:r>
-        <w:t xml:space="preserve">Equity value per share = (PV of FCFF + PV of TV − net debt $54.0B) / 948.7M diluted shares. Both figures carry over from the v3 stock-vs-flow bridge (README v3): net debt = total debt $61.3B + after-tax pension liability $7.1B (liability-only; the overfunded-plan surplus asset is deliberately excluded) − cash and marketable securities $14.4B, with operating leases and financing receivables deliberately excluded because their flows already live in the margin; shares are held flat because stock-based compensation (SBC) is charged as a cash cost — growing the count too would double-charg</w:t>
-      </w:r>
-      <w:r>
-        <w:t>e dilution [8].</w:t>
+        <w:t>Equity value per share = (PV of FCFF + PV of TV − net debt $54.0B) / 948.7M diluted shares. Both figures carry over from the v3 stock-vs-flow bridge (README v3): net debt = total debt $61.3B + after-tax pension liability $7.1B (liability-only; the overfunded-plan surplus asset is deliberately excluded) − cash and marketable securities $14.4B, with operating leases and financing receivables deliberately excluded because their flows already live in the margin; shares are held flat because stock-based compensation (SBC) is charged as a cash cost — growing the count too would double-charge dilution [8].</w:t>
       </w:r>
     </w:p>
     <w:p>
@@ -1697,6 +1693,7 @@
               <w:rPr>
                 <w:b/>
               </w:rPr>
+              <w:lastRenderedPageBreak/>
               <w:t>Driver</w:t>
             </w:r>
           </w:p>
@@ -2058,10 +2055,7 @@
               <w:pStyle w:val="TableText"/>
             </w:pPr>
             <w:r>
-              <w:t>−</w:t>
-            </w:r>
-            <w:r>
-              <w:t>1.0%</w:t>
+              <w:t>−1.0%</w:t>
             </w:r>
           </w:p>
         </w:tc>
@@ -2481,7 +2475,7 @@
               <w:pStyle w:val="TableText"/>
             </w:pPr>
             <w:r>
-              <w:t xml:space="preserve">ratio rose ~1.7% → 2.54% since 2021; constant embeds a trend break</w:t>
+              <w:t>ratio rose ~1.7% → 2.54% since 2021; constant embeds a trend break</w:t>
             </w:r>
           </w:p>
         </w:tc>
@@ -3017,10 +3011,7 @@
               <w:pStyle w:val="TableText"/>
             </w:pPr>
             <w:r>
-              <w:t>−</w:t>
-            </w:r>
-            <w:r>
-              <w:t>0.10% over rf</w:t>
+              <w:t>−0.10% over rf</w:t>
             </w:r>
           </w:p>
         </w:tc>
@@ -3075,6 +3066,7 @@
               <w:pStyle w:val="TableText"/>
             </w:pPr>
             <w:r>
+              <w:lastRenderedPageBreak/>
               <w:t>tax_rate</w:t>
             </w:r>
           </w:p>
@@ -4151,13 +4143,7 @@
         <w:rPr>
           <w:b/>
         </w:rPr>
-        <w:t>−</w:t>
-      </w:r>
-      <w:r>
-        <w:rPr>
-          <w:b/>
-        </w:rPr>
-        <w:t>$2.5B</w:t>
+        <w:t>−$2.5B</w:t>
       </w:r>
       <w:r>
         <w:t>, funded by a $6.3B debt increase. The dividend-plus-M&amp;A model is currently debt-funded.</w:t>
@@ -4187,10 +4173,11 @@
         <w:t>= 7.06%</w:t>
       </w:r>
       <w:r>
-        <w:t xml:space="preserve"> (Monte Carlo std 0.56%). Every input is externally sourced: rf 4.6% is the 10-year Treasury spot; ERP is Damodaran’s July 2026 implied premium (4.45%, carried as 4.5% in the register) [9]; kd is derived per path from rf at a fair-value-calibrated −10bp spread; E/V = 0.72 is the iterated price-value fixed point, not the circular post-crash market weight. The v3 “7.5% top-of-band” position is retired, not back-solved — the gap decomposes as rf +17bp, ERP −15bp, E/V −14bp, kd −17bp, and retirement of the old </w:t>
-      </w:r>
-      <w:r>
-        <w:t>top-of-band rounding −15bp. The WACC level alone is worth ≈ +$11.5/share versus 7.34% and +$17.6/share versus 7.50%. Residual conservatism lives transparently in β = 0.85 (versus trailing ~0.68), with the beta locus published in Section 4.</w:t>
+        <w:t xml:space="preserve"> (Monte Carlo std 0.56%). Every input is externally sourced: rf 4.6% is the 10-year Treasury spot; ERP is Damodaran’s July 2026 implied premium (4.45%, carried as 4.5% in the register) [9]; kd is derived per path from rf at a fair-value-calibrated −10bp spread; E/V = 0.72 is the iterated price-value fixed point, not the circular post-crash market weight. The v3 “7.5% top-of-band” position is retired, not back-solved — the gap decomposes as rf +17bp, ERP −15bp, E/V −14bp, kd −17bp, and retirement of the old top-of-band rounding −15bp. The WACC level alone is worth ≈ +$11.5/share versus 7.34% and +$17.6/share versus 7.50%. Residual </w:t>
+      </w:r>
+      <w:r>
+        <w:lastRenderedPageBreak/>
+        <w:t>conservatism lives transparently in β = 0.85 (versus trailing ~0.68), with the beta locus published in Section 4.</w:t>
       </w:r>
     </w:p>
     <w:p>
@@ -4208,13 +4195,7 @@
         <w:ind w:firstLine="360"/>
       </w:pPr>
       <w:r>
-        <w:t>This is the fourth version of the valuation, and each step down was an identified error, not a change of opinion. v1 concluded “fairly valued at $212” on a $202 median — retracted after review found debt charged twice, $22.3B of acquisitions treated as free while their growth was credited, and an unsourced 8.5% WACC (findings F1–F3 in the adversarial-review ledger, REVIEW.md). v2’s rebuild ($166) surfaced a net-debt bridge that double-counted stocks whose flows stayed in the margin (finding F15) and an inco</w:t>
-      </w:r>
-      <w:r>
-        <w:t>herent growth/M&amp;A pairing (finding F16). v3 ($141, signed off) fixed both and published full parameter vectors. v4 rebuilt the model driver-by-driver: 19 independent driver reviews — eighteen of nineteen demanded revisions; all were resolved — plus four consolidation reviews moved the median to $151.84 — chiefly by replacing the top-of-band 7.5% WACC with the fully sourced 7.06% build, offset by an endpoint-based margin, an SBC ramp, and a higher M&amp;A charge (DRIVER-REVIEW.md). The binding dispositions ledge</w:t>
-      </w:r>
-      <w:r>
-        <w:t>r is REVIEW.md; nothing retracted there is resurrected here.</w:t>
+        <w:t>This is the fourth version of the valuation, and each step down was an identified error, not a change of opinion. v1 concluded “fairly valued at $212” on a $202 median — retracted after review found debt charged twice, $22.3B of acquisitions treated as free while their growth was credited, and an unsourced 8.5% WACC (findings F1–F3 in the adversarial-review ledger, REVIEW.md). v2’s rebuild ($166) surfaced a net-debt bridge that double-counted stocks whose flows stayed in the margin (finding F15) and an incoherent growth/M&amp;A pairing (finding F16). v3 ($141, signed off) fixed both and published full parameter vectors. v4 rebuilt the model driver-by-driver: 19 independent driver reviews — eighteen of nineteen demanded revisions; all were resolved — plus four consolidation reviews moved the median to $151.84 — chiefly by replacing the top-of-band 7.5% WACC with the fully sourced 7.06% build, offset by an endpoint-based margin, an SBC ramp, and a higher M&amp;A charge (DRIVER-REVIEW.md). The binding dispositions ledger is REVIEW.md; nothing retracted there is resurrected here.</w:t>
       </w:r>
     </w:p>
     <w:p>
@@ -4257,10 +4238,7 @@
         <w:t>Tail caveat — applies to every bracket in this report.</w:t>
       </w:r>
       <w:r>
-        <w:t xml:space="preserve"> Each path holds one growth draw for all ten years; mean reversion is unmodeled (ticketed model improvement T-DCF-1, the largest known distortion), so the left tail is understated even after the v4 correlation matrix fattened it relative to v3. “P50s are robust; P10s are optimistic. No margin-of-safety claim is made from these tails” (README v3 tail caveat, per the F6 disposition — the adversarial review’s tail-sampling finding; carried verbatim). With TV/EV at 64.1%, the valuation leans heavily on the Gord</w:t>
-      </w:r>
-      <w:r>
-        <w:t>on inputs. Until AR(1) growth lands, treat P10/P90 as decorative.</w:t>
+        <w:t xml:space="preserve"> Each path holds one growth draw for all ten years; mean reversion is unmodeled (ticketed model improvement T-DCF-1, the largest known distortion), so the left tail is understated even after the v4 correlation matrix fattened it relative to v3. “P50s are robust; P10s are optimistic. No margin-of-safety claim is made from these tails” (README v3 tail caveat, per the F6 disposition — the adversarial review’s tail-sampling finding; carried verbatim). With TV/EV at 64.1%, the valuation leans heavily on the Gordon inputs. Until AR(1) growth lands, treat P10/P90 as decorative.</w:t>
       </w:r>
     </w:p>
     <w:p>
@@ -4342,13 +4320,7 @@
               <w:rPr>
                 <w:b/>
               </w:rPr>
-              <w:t>−</w:t>
-            </w:r>
-            <w:r>
-              <w:rPr>
-                <w:b/>
-              </w:rPr>
-              <w:t>1σ</w:t>
+              <w:t>−1σ</w:t>
             </w:r>
           </w:p>
         </w:tc>
@@ -4397,10 +4369,7 @@
               <w:jc w:val="right"/>
             </w:pPr>
             <w:r>
-              <w:t>−</w:t>
-            </w:r>
-            <w:r>
-              <w:t>$31.34</w:t>
+              <w:t>−$31.34</w:t>
             </w:r>
           </w:p>
         </w:tc>
@@ -4443,10 +4412,7 @@
               <w:jc w:val="right"/>
             </w:pPr>
             <w:r>
-              <w:t>−</w:t>
-            </w:r>
-            <w:r>
-              <w:t>$19.27</w:t>
+              <w:t>−$19.27</w:t>
             </w:r>
           </w:p>
         </w:tc>
@@ -4503,10 +4469,7 @@
               <w:jc w:val="right"/>
             </w:pPr>
             <w:r>
-              <w:t>−</w:t>
-            </w:r>
-            <w:r>
-              <w:t>$18.96</w:t>
+              <w:t>−$18.96</w:t>
             </w:r>
           </w:p>
         </w:tc>
@@ -4521,6 +4484,7 @@
               <w:pStyle w:val="TableText"/>
             </w:pPr>
             <w:r>
+              <w:lastRenderedPageBreak/>
               <w:t>erp</w:t>
             </w:r>
           </w:p>
@@ -4549,10 +4513,7 @@
               <w:jc w:val="right"/>
             </w:pPr>
             <w:r>
-              <w:t>−</w:t>
-            </w:r>
-            <w:r>
-              <w:t>$18.54</w:t>
+              <w:t>−$18.54</w:t>
             </w:r>
           </w:p>
         </w:tc>
@@ -4581,10 +4542,7 @@
               <w:jc w:val="right"/>
             </w:pPr>
             <w:r>
-              <w:t>−</w:t>
-            </w:r>
-            <w:r>
-              <w:t>$18.18</w:t>
+              <w:t>−$18.18</w:t>
             </w:r>
           </w:p>
         </w:tc>
@@ -4641,10 +4599,7 @@
               <w:jc w:val="right"/>
             </w:pPr>
             <w:r>
-              <w:t>−</w:t>
-            </w:r>
-            <w:r>
-              <w:t>$18.71</w:t>
+              <w:t>−$18.71</w:t>
             </w:r>
           </w:p>
         </w:tc>
@@ -4673,10 +4628,7 @@
               <w:jc w:val="right"/>
             </w:pPr>
             <w:r>
-              <w:t>−</w:t>
-            </w:r>
-            <w:r>
-              <w:t>$9.87</w:t>
+              <w:t>−$9.87</w:t>
             </w:r>
           </w:p>
         </w:tc>
@@ -4719,10 +4671,7 @@
               <w:jc w:val="right"/>
             </w:pPr>
             <w:r>
-              <w:t>−</w:t>
-            </w:r>
-            <w:r>
-              <w:t>$5.45</w:t>
+              <w:t>−$5.45</w:t>
             </w:r>
           </w:p>
         </w:tc>
@@ -5355,7 +5304,11 @@
         <w:t>The price sits above every published median.</w:t>
       </w:r>
       <w:r>
-        <w:t xml:space="preserve"> At the base f = 0.50 the market pays $60 (40%) over the model’s median; at f = 0 — conceding that IBM’s entire acquisition program is optional — the gap is still $15. The cheapest published route toward $212 is the discount rate: at trailing β 0.68 the WACC build lands at ≈6.5% and the median reaches $179.42, still $33 short. Stacked generosity (f = 0 and trailing beta) was not run and is not claimed; within the published grid, $212 requires a sub-6.5% discount rate or the bull path. </w:t>
+        <w:t xml:space="preserve"> At the base f = 0.50 the market pays $60 (40%) over the model’s median; at f = 0 — conceding that IBM’s entire acquisition program is optional — the gap is still $15. The cheapest published route toward $212 is the discount rate: at trailing β 0.68 the WACC build lands at </w:t>
+      </w:r>
+      <w:r>
+        <w:lastRenderedPageBreak/>
+        <w:t xml:space="preserve">≈6.5% and the median reaches $179.42, still $33 short. Stacked generosity (f = 0 and trailing beta) was not run and is not claimed; within the published grid, $212 requires a sub-6.5% discount rate or the bull path. </w:t>
       </w:r>
       <w:r>
         <w:rPr>
@@ -5375,7 +5328,7 @@
         <w:rPr>
           <w:b/>
         </w:rPr>
-        <w:t xml:space="preserve">Our reading of the options market: it is pricing the event, not the verdict.</w:t>
+        <w:t>Our reading of the options market: it is pricing the event, not the verdict.</w:t>
       </w:r>
       <w:r>
         <w:t xml:space="preserve"> As of the 2026-07-16 snapshot (README v3): the Jul-24 expiry implies a </w:t>
@@ -5467,6 +5420,24 @@
         <w:rPr>
           <w:b/>
         </w:rPr>
+        <w:t>Remaining performance obligation (RPO) in the Q2 10-Q.</w:t>
+      </w:r>
+      <w:r>
+        <w:t xml:space="preserve"> IBM’s contracted backlog was $71.0B at FY2025 — 105.1% of revenue, up from 97.5% in FY2022, with ~67% recognized within two years [10]. Watch whether coverage holds at or above 105% and whether the year-over-year change stays positive — read net of acquisition effects, since the FY2025 +12.7% print consolidates HashiCorp’s acquired obligations.</w:t>
+      </w:r>
+    </w:p>
+    <w:p>
+      <w:pPr>
+        <w:numPr>
+          <w:ilvl w:val="0"/>
+          <w:numId w:val="1"/>
+        </w:numPr>
+        <w:spacing w:after="60"/>
+      </w:pPr>
+      <w:r>
+        <w:rPr>
+          <w:b/>
+        </w:rPr>
         <w:t>Segment actuals versus the year-1 pins.</w:t>
       </w:r>
       <w:r>
@@ -5506,7 +5477,11 @@
         <w:t>Model debt (ticketed model improvements).</w:t>
       </w:r>
       <w:r>
-        <w:t xml:space="preserve"> T-DCF-1: growth is one draw per path — AR(1) mean reversion is the largest known distortion (a reviewer experiment with φ = 0.6 cut the v3 median ~10% and P90 ~16%). T-DCF-3: terminal growth should derive per path from faded segment draws; today it is correlationally, not structurally, anchored. Mixture/lognormal marginals (consulting left skew, M&amp;A right tail) and Harris–Pringle re-levered beta with target weights are ticketed. FX is unmodeled; the WACC term structure is flat.</w:t>
+        <w:t xml:space="preserve"> T-DCF-1: growth is one draw per path — AR(1) mean reversion is the largest known distortion (a reviewer experiment with φ = 0.6 cut the v3 median ~10% and P90 ~16%). T-DCF-3: terminal growth should derive per path from faded segment draws; today it is correlationally, not structurally, anchored. Mixture/lognormal </w:t>
+      </w:r>
+      <w:r>
+        <w:lastRenderedPageBreak/>
+        <w:t>marginals (consulting left skew, M&amp;A right tail) and Harris–Pringle re-levered beta with target weights are ticketed. FX is unmodeled; the WACC term structure is flat.</w:t>
       </w:r>
     </w:p>
     <w:p>
@@ -5543,6 +5518,24 @@
       </w:r>
       <w:r>
         <w:t xml:space="preserve"> Segment history is hand-entered from the 8-Ks (sourced). The headline is conditional on f = 0.50 by construction; there is no model-internal way to estimate f — it is the analysis’s central judgment, which is why the locus is published.</w:t>
+      </w:r>
+    </w:p>
+    <w:p>
+      <w:pPr>
+        <w:numPr>
+          <w:ilvl w:val="0"/>
+          <w:numId w:val="2"/>
+        </w:numPr>
+        <w:spacing w:after="60"/>
+      </w:pPr>
+      <w:r>
+        <w:rPr>
+          <w:b/>
+        </w:rPr>
+        <w:t>Unused-source audit (RPO).</w:t>
+      </w:r>
+      <w:r>
+        <w:t xml:space="preserve"> The $71.0B RPO was flagged by the source audit as unused by the model; a targeted review concluded it corroborates but does not move the growth priors (two-year contracted cover cannot rebut a ten-year cannibalization thesis, and the backlog growth partly consolidates acquisitions). It is consumed as documented evidence in the assumption register and expires at the Q2 10-Q [10].</w:t>
       </w:r>
     </w:p>
     <w:p>
@@ -5931,10 +5924,7 @@
               <w:jc w:val="center"/>
             </w:pPr>
             <w:r>
-              <w:t>−</w:t>
-            </w:r>
-            <w:r>
-              <w:t>.25</w:t>
+              <w:t>−.25</w:t>
             </w:r>
           </w:p>
         </w:tc>
@@ -6064,10 +6054,7 @@
               <w:jc w:val="center"/>
             </w:pPr>
             <w:r>
-              <w:t>−</w:t>
-            </w:r>
-            <w:r>
-              <w:t>.25</w:t>
+              <w:t>−.25</w:t>
             </w:r>
           </w:p>
         </w:tc>
@@ -6197,10 +6184,7 @@
               <w:jc w:val="center"/>
             </w:pPr>
             <w:r>
-              <w:t>−</w:t>
-            </w:r>
-            <w:r>
-              <w:t>.15</w:t>
+              <w:t>−.15</w:t>
             </w:r>
           </w:p>
         </w:tc>
@@ -6330,10 +6314,7 @@
               <w:jc w:val="center"/>
             </w:pPr>
             <w:r>
-              <w:t>−</w:t>
-            </w:r>
-            <w:r>
-              <w:t>.15</w:t>
+              <w:t>−.15</w:t>
             </w:r>
           </w:p>
         </w:tc>
@@ -6449,10 +6430,7 @@
               <w:jc w:val="center"/>
             </w:pPr>
             <w:r>
-              <w:t>−</w:t>
-            </w:r>
-            <w:r>
-              <w:t>.15</w:t>
+              <w:t>−.15</w:t>
             </w:r>
           </w:p>
         </w:tc>
@@ -6466,10 +6444,7 @@
               <w:jc w:val="center"/>
             </w:pPr>
             <w:r>
-              <w:t>−</w:t>
-            </w:r>
-            <w:r>
-              <w:t>.10</w:t>
+              <w:t>−.10</w:t>
             </w:r>
           </w:p>
         </w:tc>
@@ -6501,6 +6476,7 @@
               <w:rPr>
                 <w:b/>
               </w:rPr>
+              <w:lastRenderedPageBreak/>
               <w:t>rf</w:t>
             </w:r>
           </w:p>
@@ -6571,10 +6547,7 @@
               <w:jc w:val="center"/>
             </w:pPr>
             <w:r>
-              <w:t>−</w:t>
-            </w:r>
-            <w:r>
-              <w:t>.15</w:t>
+              <w:t>−.15</w:t>
             </w:r>
           </w:p>
         </w:tc>
@@ -6602,10 +6575,7 @@
               <w:jc w:val="center"/>
             </w:pPr>
             <w:r>
-              <w:t>−</w:t>
-            </w:r>
-            <w:r>
-              <w:t>.30</w:t>
+              <w:t>−.30</w:t>
             </w:r>
           </w:p>
         </w:tc>
@@ -6651,10 +6621,7 @@
               <w:jc w:val="center"/>
             </w:pPr>
             <w:r>
-              <w:t>−</w:t>
-            </w:r>
-            <w:r>
-              <w:t>.25</w:t>
+              <w:t>−.25</w:t>
             </w:r>
           </w:p>
         </w:tc>
@@ -6668,10 +6635,7 @@
               <w:jc w:val="center"/>
             </w:pPr>
             <w:r>
-              <w:t>−</w:t>
-            </w:r>
-            <w:r>
-              <w:t>.25</w:t>
+              <w:t>−.25</w:t>
             </w:r>
           </w:p>
         </w:tc>
@@ -6685,10 +6649,7 @@
               <w:jc w:val="center"/>
             </w:pPr>
             <w:r>
-              <w:t>−</w:t>
-            </w:r>
-            <w:r>
-              <w:t>.15</w:t>
+              <w:t>−.15</w:t>
             </w:r>
           </w:p>
         </w:tc>
@@ -6702,10 +6663,7 @@
               <w:jc w:val="center"/>
             </w:pPr>
             <w:r>
-              <w:t>−</w:t>
-            </w:r>
-            <w:r>
-              <w:t>.15</w:t>
+              <w:t>−.15</w:t>
             </w:r>
           </w:p>
         </w:tc>
@@ -6719,10 +6677,7 @@
               <w:jc w:val="center"/>
             </w:pPr>
             <w:r>
-              <w:t>−</w:t>
-            </w:r>
-            <w:r>
-              <w:t>.10</w:t>
+              <w:t>−.10</w:t>
             </w:r>
           </w:p>
         </w:tc>
@@ -6736,10 +6691,7 @@
               <w:jc w:val="center"/>
             </w:pPr>
             <w:r>
-              <w:t>−</w:t>
-            </w:r>
-            <w:r>
-              <w:t>.30</w:t>
+              <w:t>−.30</w:t>
             </w:r>
           </w:p>
         </w:tc>
@@ -6767,10 +6719,7 @@
               <w:jc w:val="center"/>
             </w:pPr>
             <w:r>
-              <w:t>−</w:t>
-            </w:r>
-            <w:r>
-              <w:t>.20</w:t>
+              <w:t>−.20</w:t>
             </w:r>
           </w:p>
         </w:tc>
@@ -6886,10 +6835,7 @@
               <w:jc w:val="center"/>
             </w:pPr>
             <w:r>
-              <w:t>−</w:t>
-            </w:r>
-            <w:r>
-              <w:t>.20</w:t>
+              <w:t>−.20</w:t>
             </w:r>
           </w:p>
         </w:tc>
@@ -7073,6 +7019,21 @@
     </w:p>
     <w:p>
       <w:pPr>
+        <w:numPr>
+          <w:ilvl w:val="0"/>
+          <w:numId w:val="3"/>
+        </w:numPr>
+        <w:spacing w:after="60"/>
+      </w:pPr>
+      <w:r>
+        <w:rPr>
+          <w:sz w:val="19"/>
+        </w:rPr>
+        <w:t>IBM FY2025 Form 10-K (RPO $71.0B and duration split, revenue note) — https://www.sec.gov/Archives/edgar/data/51143/000005114326000010/ibm-20251231.htm</w:t>
+      </w:r>
+    </w:p>
+    <w:p>
+      <w:pPr>
         <w:ind w:firstLine="360"/>
       </w:pPr>
       <w:r>
@@ -7114,6 +7075,7 @@
           <w:rFonts w:ascii="Consolas" w:hAnsi="Consolas" w:eastAsia="Consolas"/>
           <w:sz w:val="19"/>
         </w:rPr>
+        <w:lastRenderedPageBreak/>
         <w:t>analysis/IBM/driver_model.py</w:t>
       </w:r>
       <w:r>
@@ -7186,7 +7148,29 @@
         <w:rPr>
           <w:sz w:val="19"/>
         </w:rPr>
-        <w:t xml:space="preserve"> — v4 driver-level reviews (19 round-1 + 4 consolidation) and dispositions</w:t>
+        <w:t xml:space="preserve"> — v4 driver-level reviews (19 round-1 + 4 consolidation) and dispositions, including the RPO re-look (all proposed parameter changes rejected; v4 numbers unchanged)</w:t>
+      </w:r>
+    </w:p>
+    <w:p>
+      <w:pPr>
+        <w:numPr>
+          <w:ilvl w:val="0"/>
+          <w:numId w:val="4"/>
+        </w:numPr>
+        <w:spacing w:after="60"/>
+      </w:pPr>
+      <w:r>
+        <w:rPr>
+          <w:rFonts w:ascii="Consolas" w:hAnsi="Consolas" w:eastAsia="Consolas"/>
+          <w:sz w:val="19"/>
+        </w:rPr>
+        <w:t>analysis/IBM/research-ledger.md</w:t>
+      </w:r>
+      <w:r>
+        <w:rPr>
+          <w:sz w:val="19"/>
+        </w:rPr>
+        <w:t xml:space="preserve"> — frozen, source-tagged facts consumed by the model (RPO facts expire at the Q2-2026 10-Q)</w:t>
       </w:r>
     </w:p>
     <w:sectPr>
@@ -7263,26 +7247,15 @@
       </w:rPr>
       <w:t xml:space="preserve"> of </w:t>
     </w:r>
-    <w:r>
-      <w:rPr/>
-      <w:fldChar w:fldCharType="begin" w:dirty="false"/>
-    </w:r>
-    <w:r>
-      <w:instrText xml:space="preserve"> NUMPAGES </w:instrText>
-    </w:r>
-    <w:r>
-      <w:fldChar w:fldCharType="separate"/>
-    </w:r>
-    <w:r>
-      <w:rPr>
-        <w:color w:val="595959"/>
-        <w:sz w:val="18"/>
-      </w:rPr>
-      <w:t>10</w:t>
-    </w:r>
-    <w:r>
-      <w:fldChar w:fldCharType="end"/>
-    </w:r>
+    <w:fldSimple w:instr=" NUMPAGES ">
+      <w:r>
+        <w:rPr>
+          <w:color w:val="595959"/>
+          <w:sz w:val="18"/>
+        </w:rPr>
+        <w:t>11</w:t>
+      </w:r>
+    </w:fldSimple>
   </w:p>
 </w:ftr>
 </file>

</xml_diff>